<commit_message>
Ajout de la partie CLoud Formation dans le cours AWS
</commit_message>
<xml_diff>
--- a/AWS-Amazone_web_services/Formation_AWS_Introduction.docx
+++ b/AWS-Amazone_web_services/Formation_AWS_Introduction.docx
@@ -248,7 +248,7 @@
           <w:sz w:val="22"/>
           <w:szCs w:val="22"/>
         </w:rPr>
-        <w:t xml:space="preserve">11. Récapitulatif des commandes essentielles</w:t>
+        <w:t xml:space="preserve">11. Lambda, DynamoDB &amp; CloudFormation — le Serverless et l'Infrastructure as Code</w:t>
       </w:r>
     </w:p>
     <w:p>
@@ -260,7 +260,19 @@
           <w:sz w:val="22"/>
           <w:szCs w:val="22"/>
         </w:rPr>
-        <w:t xml:space="preserve">12. Ressources et sources</w:t>
+        <w:t xml:space="preserve">12. Récapitulatif des commandes essentielles</w:t>
+      </w:r>
+    </w:p>
+    <w:p>
+      <w:pPr>
+        <w:spacing w:after="150" w:line="300"/>
+      </w:pPr>
+      <w:r>
+        <w:rPr>
+          <w:sz w:val="22"/>
+          <w:szCs w:val="22"/>
+        </w:rPr>
+        <w:t xml:space="preserve">13. Ressources et sources</w:t>
       </w:r>
     </w:p>
     <w:p>
@@ -3900,9 +3912,118 @@
           <w:sz w:val="32"/>
           <w:szCs w:val="32"/>
         </w:rPr>
-        <w:t xml:space="preserve">11. Récapitulatif des commandes essentielles</w:t>
-      </w:r>
-    </w:p>
+        <w:t xml:space="preserve">11. Lambda, DynamoDB &amp; CloudFormation</w:t>
+      </w:r>
+    </w:p>
+    <w:p>
+      <w:pPr>
+        <w:spacing w:after="150" w:line="300"/>
+      </w:pPr>
+      <w:r>
+        <w:rPr>
+          <w:sz w:val="22"/>
+          <w:szCs w:val="22"/>
+        </w:rPr>
+        <w:t xml:space="preserve">Ces trois services vont souvent de pair dans les architectures modernes "serverless" : Lambda exécute le code, DynamoDB stocke les données, et CloudFormation déploie l'ensemble de façon automatisée et reproductible.</w:t>
+      </w:r>
+    </w:p>
+    <w:p>
+      <w:pPr>
+        <w:pStyle w:val="Heading2"/>
+        <w:spacing w:after="150" w:before="300"/>
+      </w:pPr>
+      <w:r>
+        <w:rPr>
+          <w:b/>
+          <w:bCs/>
+          <w:color w:val="2E75B6"/>
+          <w:sz w:val="26"/>
+          <w:szCs w:val="26"/>
+        </w:rPr>
+        <w:t xml:space="preserve">11.1 AWS Lambda</w:t>
+      </w:r>
+    </w:p>
+    <w:tbl>
+      <w:tblPr>
+        <w:tblW w:type="pct" w:w="100%"/>
+        <w:tblBorders>
+          <w:top w:val="single" w:color="548235" w:sz="6"/>
+          <w:left w:val="single" w:color="548235" w:sz="6"/>
+          <w:bottom w:val="single" w:color="548235" w:sz="6"/>
+          <w:right w:val="single" w:color="548235" w:sz="6"/>
+          <w:insideH w:val="none" w:color="FFFFFF" w:sz="0"/>
+          <w:insideV w:val="none" w:color="FFFFFF" w:sz="0"/>
+        </w:tblBorders>
+      </w:tblPr>
+      <w:tblGrid>
+        <w:gridCol w:w="9350"/>
+      </w:tblGrid>
+      <w:tr>
+        <w:tc>
+          <w:tcPr>
+            <w:tcW w:type="pct" w:w="100%"/>
+            <w:shd w:fill="E2F0D9" w:val="clear"/>
+            <w:tcMar>
+              <w:top w:type="dxa" w:w="150"/>
+              <w:left w:type="dxa" w:w="200"/>
+              <w:bottom w:type="dxa" w:w="150"/>
+              <w:right w:type="dxa" w:w="200"/>
+            </w:tcMar>
+          </w:tcPr>
+          <w:p>
+            <w:pPr>
+              <w:spacing w:after="100"/>
+            </w:pPr>
+            <w:r>
+              <w:rPr>
+                <w:b/>
+                <w:bCs/>
+                <w:color w:val="548235"/>
+                <w:sz w:val="21"/>
+                <w:szCs w:val="21"/>
+              </w:rPr>
+              <w:t xml:space="preserve">🧩 SERVICE : Lambda</w:t>
+            </w:r>
+          </w:p>
+          <w:p>
+            <w:pPr>
+              <w:spacing w:after="60"/>
+            </w:pPr>
+            <w:r>
+              <w:rPr>
+                <w:sz w:val="21"/>
+                <w:szCs w:val="21"/>
+              </w:rPr>
+              <w:t xml:space="preserve">Qu'est-ce que c'est ? Un service de calcul "serverless" (sans serveur) : on écrit une fonction (du code), et AWS l'exécute à la demande, sans qu'il soit nécessaire de provisionner ni de gérer de serveur.</w:t>
+            </w:r>
+          </w:p>
+          <w:p>
+            <w:pPr>
+              <w:spacing w:after="60"/>
+            </w:pPr>
+            <w:r>
+              <w:rPr>
+                <w:sz w:val="21"/>
+                <w:szCs w:val="21"/>
+              </w:rPr>
+              <w:t xml:space="preserve">À quoi ça sert ? Exécuter du code en réaction à un événement (upload d'un fichier sur S3, appel d'API, message dans une file d'attente, tâche planifiée type cron...) sans avoir de serveur qui tourne en permanence.</w:t>
+            </w:r>
+          </w:p>
+          <w:p>
+            <w:pPr>
+              <w:spacing w:after="60"/>
+            </w:pPr>
+            <w:r>
+              <w:rPr>
+                <w:sz w:val="21"/>
+                <w:szCs w:val="21"/>
+              </w:rPr>
+              <w:t xml:space="preserve">Comment ça marche ? On dépose son code (Python, Node.js, Java, etc.) dans une fonction Lambda, on lui associe un déclencheur (trigger). AWS lance automatiquement une instance d'exécution isolée à chaque événement, puis la libère. La facturation se fait au temps d'exécution réel, à la milliseconde près.</w:t>
+            </w:r>
+          </w:p>
+        </w:tc>
+      </w:tr>
+    </w:tbl>
     <w:p>
       <w:pPr>
         <w:pStyle w:val="Heading3"/>
@@ -3916,7 +4037,75 @@
           <w:sz w:val="23"/>
           <w:szCs w:val="23"/>
         </w:rPr>
-        <w:t xml:space="preserve">Configuration générale</w:t>
+        <w:t xml:space="preserve">Concepts clés</w:t>
+      </w:r>
+    </w:p>
+    <w:p>
+      <w:pPr>
+        <w:pStyle w:val="ListParagraph"/>
+        <w:numPr>
+          <w:ilvl w:val="0"/>
+          <w:numId w:val="2"/>
+        </w:numPr>
+        <w:spacing w:after="80"/>
+      </w:pPr>
+      <w:r>
+        <w:rPr>
+          <w:sz w:val="22"/>
+          <w:szCs w:val="22"/>
+        </w:rPr>
+        <w:t xml:space="preserve">Fonction : l'unité de code déployée (avec son runtime, sa mémoire allouée, son timeout).</w:t>
+      </w:r>
+    </w:p>
+    <w:p>
+      <w:pPr>
+        <w:pStyle w:val="ListParagraph"/>
+        <w:numPr>
+          <w:ilvl w:val="0"/>
+          <w:numId w:val="2"/>
+        </w:numPr>
+        <w:spacing w:after="80"/>
+      </w:pPr>
+      <w:r>
+        <w:rPr>
+          <w:sz w:val="22"/>
+          <w:szCs w:val="22"/>
+        </w:rPr>
+        <w:t xml:space="preserve">Déclencheur (trigger) : l'événement qui invoque la fonction (S3, API Gateway, EventBridge, DynamoDB Streams...).</w:t>
+      </w:r>
+    </w:p>
+    <w:p>
+      <w:pPr>
+        <w:pStyle w:val="ListParagraph"/>
+        <w:numPr>
+          <w:ilvl w:val="0"/>
+          <w:numId w:val="2"/>
+        </w:numPr>
+        <w:spacing w:after="80"/>
+      </w:pPr>
+      <w:r>
+        <w:rPr>
+          <w:sz w:val="22"/>
+          <w:szCs w:val="22"/>
+        </w:rPr>
+        <w:t xml:space="preserve">Exécution à la demande : aucune facturation quand la fonction n'est pas invoquée (contrairement à EC2).</w:t>
+      </w:r>
+    </w:p>
+    <w:p>
+      <w:pPr>
+        <w:pStyle w:val="ListParagraph"/>
+        <w:numPr>
+          <w:ilvl w:val="0"/>
+          <w:numId w:val="2"/>
+        </w:numPr>
+        <w:spacing w:after="80"/>
+      </w:pPr>
+      <w:r>
+        <w:rPr>
+          <w:sz w:val="22"/>
+          <w:szCs w:val="22"/>
+        </w:rPr>
+        <w:t xml:space="preserve">Limite de temps d'exécution : 15 minutes maximum par invocation (au-delà, prévoir EC2 ou ECS).</w:t>
       </w:r>
     </w:p>
     <w:tbl>
@@ -3956,35 +4145,233 @@
                 <w:sz w:val="20"/>
                 <w:szCs w:val="20"/>
               </w:rPr>
-              <w:t xml:space="preserve">$ aws configure</w:t>
-            </w:r>
-          </w:p>
-          <w:p>
-            <w:pPr>
-              <w:spacing w:after="40"/>
-            </w:pPr>
-            <w:r>
-              <w:rPr>
-                <w:rFonts w:ascii="Consolas" w:cs="Consolas" w:eastAsia="Consolas" w:hAnsi="Consolas"/>
-                <w:color w:val="6CE26C"/>
-                <w:sz w:val="20"/>
-                <w:szCs w:val="20"/>
-              </w:rPr>
-              <w:t xml:space="preserve">$ aws --version</w:t>
-            </w:r>
-          </w:p>
-          <w:p>
-            <w:pPr>
-              <w:spacing w:after="40"/>
-            </w:pPr>
-            <w:r>
-              <w:rPr>
-                <w:rFonts w:ascii="Consolas" w:cs="Consolas" w:eastAsia="Consolas" w:hAnsi="Consolas"/>
-                <w:color w:val="6CE26C"/>
-                <w:sz w:val="20"/>
-                <w:szCs w:val="20"/>
-              </w:rPr>
-              <w:t xml:space="preserve">$ aws sts get-caller-identity</w:t>
+              <w:t xml:space="preserve">$ aws lambda create-function --function-name maFonction --runtime python3.12 --role arn:aws:iam::123456789012:role/lambda-role --handler app.handler --zip-file fileb://fonction.zip</w:t>
+            </w:r>
+          </w:p>
+          <w:p>
+            <w:pPr>
+              <w:spacing w:after="40"/>
+            </w:pPr>
+            <w:r>
+              <w:rPr>
+                <w:rFonts w:ascii="Consolas" w:cs="Consolas" w:eastAsia="Consolas" w:hAnsi="Consolas"/>
+                <w:color w:val="6CE26C"/>
+                <w:sz w:val="20"/>
+                <w:szCs w:val="20"/>
+              </w:rPr>
+              <w:t xml:space="preserve">$ aws lambda invoke --function-name maFonction resultat.json</w:t>
+            </w:r>
+          </w:p>
+          <w:p>
+            <w:pPr>
+              <w:spacing w:after="40"/>
+            </w:pPr>
+            <w:r>
+              <w:rPr>
+                <w:rFonts w:ascii="Consolas" w:cs="Consolas" w:eastAsia="Consolas" w:hAnsi="Consolas"/>
+                <w:color w:val="6CE26C"/>
+                <w:sz w:val="20"/>
+                <w:szCs w:val="20"/>
+              </w:rPr>
+              <w:t xml:space="preserve">$ aws lambda list-functions</w:t>
+            </w:r>
+          </w:p>
+          <w:p>
+            <w:pPr>
+              <w:spacing w:after="40"/>
+            </w:pPr>
+            <w:r>
+              <w:rPr>
+                <w:rFonts w:ascii="Consolas" w:cs="Consolas" w:eastAsia="Consolas" w:hAnsi="Consolas"/>
+                <w:color w:val="6CE26C"/>
+                <w:sz w:val="20"/>
+                <w:szCs w:val="20"/>
+              </w:rPr>
+              <w:t xml:space="preserve">$ aws lambda update-function-code --function-name maFonction --zip-file fileb://fonction.zip</w:t>
+            </w:r>
+          </w:p>
+          <w:p>
+            <w:pPr>
+              <w:spacing w:after="40"/>
+            </w:pPr>
+            <w:r>
+              <w:rPr>
+                <w:rFonts w:ascii="Consolas" w:cs="Consolas" w:eastAsia="Consolas" w:hAnsi="Consolas"/>
+                <w:color w:val="6CE26C"/>
+                <w:sz w:val="20"/>
+                <w:szCs w:val="20"/>
+              </w:rPr>
+              <w:t xml:space="preserve">$ aws lambda delete-function --function-name maFonction</w:t>
+            </w:r>
+          </w:p>
+          <w:p>
+            <w:pPr>
+              <w:spacing w:before="100"/>
+            </w:pPr>
+            <w:r>
+              <w:rPr>
+                <w:rFonts w:ascii="Consolas" w:cs="Consolas" w:eastAsia="Consolas" w:hAnsi="Consolas"/>
+                <w:i/>
+                <w:iCs/>
+                <w:color w:val="CCCCCC"/>
+                <w:sz w:val="19"/>
+                <w:szCs w:val="19"/>
+              </w:rPr>
+              <w:t xml:space="preserve">→ Créer une fonction Lambda à partir d'un fichier zip, l'invoquer manuellement, lister les fonctions existantes, mettre à jour son code, puis la supprimer.</w:t>
+            </w:r>
+          </w:p>
+        </w:tc>
+      </w:tr>
+    </w:tbl>
+    <w:tbl>
+      <w:tblPr>
+        <w:tblW w:type="pct" w:w="100%"/>
+        <w:tblBorders>
+          <w:top w:val="single" w:color="BF8F00" w:sz="6"/>
+          <w:left w:val="single" w:color="BF8F00" w:sz="6"/>
+          <w:bottom w:val="single" w:color="BF8F00" w:sz="6"/>
+          <w:right w:val="single" w:color="BF8F00" w:sz="6"/>
+          <w:insideH w:val="none" w:color="FFFFFF" w:sz="0"/>
+          <w:insideV w:val="none" w:color="FFFFFF" w:sz="0"/>
+        </w:tblBorders>
+      </w:tblPr>
+      <w:tblGrid>
+        <w:gridCol w:w="9350"/>
+      </w:tblGrid>
+      <w:tr>
+        <w:tc>
+          <w:tcPr>
+            <w:tcW w:type="pct" w:w="100%"/>
+            <w:shd w:fill="FFF2CC" w:val="clear"/>
+            <w:tcMar>
+              <w:top w:type="dxa" w:w="150"/>
+              <w:left w:type="dxa" w:w="200"/>
+              <w:bottom w:type="dxa" w:w="150"/>
+              <w:right w:type="dxa" w:w="200"/>
+            </w:tcMar>
+          </w:tcPr>
+          <w:p>
+            <w:pPr>
+              <w:spacing w:after="100"/>
+            </w:pPr>
+            <w:r>
+              <w:rPr>
+                <w:b/>
+                <w:bCs/>
+                <w:color w:val="BF8F00"/>
+                <w:sz w:val="21"/>
+                <w:szCs w:val="21"/>
+              </w:rPr>
+              <w:t xml:space="preserve">💡 À retenir</w:t>
+            </w:r>
+          </w:p>
+          <w:p>
+            <w:pPr>
+              <w:spacing w:after="60"/>
+            </w:pPr>
+            <w:r>
+              <w:rPr>
+                <w:sz w:val="21"/>
+                <w:szCs w:val="21"/>
+              </w:rPr>
+              <w:t xml:space="preserve">Lambda ne remplace pas EC2 : il est adapté à des traitements courts et événementiels, pas à des applications qui tournent en continu.</w:t>
+            </w:r>
+          </w:p>
+        </w:tc>
+      </w:tr>
+    </w:tbl>
+    <w:p>
+      <w:pPr>
+        <w:pStyle w:val="Heading2"/>
+        <w:spacing w:after="150" w:before="300"/>
+      </w:pPr>
+      <w:r>
+        <w:rPr>
+          <w:b/>
+          <w:bCs/>
+          <w:color w:val="2E75B6"/>
+          <w:sz w:val="26"/>
+          <w:szCs w:val="26"/>
+        </w:rPr>
+        <w:t xml:space="preserve">11.2 Amazon DynamoDB</w:t>
+      </w:r>
+    </w:p>
+    <w:tbl>
+      <w:tblPr>
+        <w:tblW w:type="pct" w:w="100%"/>
+        <w:tblBorders>
+          <w:top w:val="single" w:color="548235" w:sz="6"/>
+          <w:left w:val="single" w:color="548235" w:sz="6"/>
+          <w:bottom w:val="single" w:color="548235" w:sz="6"/>
+          <w:right w:val="single" w:color="548235" w:sz="6"/>
+          <w:insideH w:val="none" w:color="FFFFFF" w:sz="0"/>
+          <w:insideV w:val="none" w:color="FFFFFF" w:sz="0"/>
+        </w:tblBorders>
+      </w:tblPr>
+      <w:tblGrid>
+        <w:gridCol w:w="9350"/>
+      </w:tblGrid>
+      <w:tr>
+        <w:tc>
+          <w:tcPr>
+            <w:tcW w:type="pct" w:w="100%"/>
+            <w:shd w:fill="E2F0D9" w:val="clear"/>
+            <w:tcMar>
+              <w:top w:type="dxa" w:w="150"/>
+              <w:left w:type="dxa" w:w="200"/>
+              <w:bottom w:type="dxa" w:w="150"/>
+              <w:right w:type="dxa" w:w="200"/>
+            </w:tcMar>
+          </w:tcPr>
+          <w:p>
+            <w:pPr>
+              <w:spacing w:after="100"/>
+            </w:pPr>
+            <w:r>
+              <w:rPr>
+                <w:b/>
+                <w:bCs/>
+                <w:color w:val="548235"/>
+                <w:sz w:val="21"/>
+                <w:szCs w:val="21"/>
+              </w:rPr>
+              <w:t xml:space="preserve">🧩 SERVICE : DynamoDB</w:t>
+            </w:r>
+          </w:p>
+          <w:p>
+            <w:pPr>
+              <w:spacing w:after="60"/>
+            </w:pPr>
+            <w:r>
+              <w:rPr>
+                <w:sz w:val="21"/>
+                <w:szCs w:val="21"/>
+              </w:rPr>
+              <w:t xml:space="preserve">Qu'est-ce que c'est ? Une base de données NoSQL (clé-valeur / document) entièrement managée par AWS.</w:t>
+            </w:r>
+          </w:p>
+          <w:p>
+            <w:pPr>
+              <w:spacing w:after="60"/>
+            </w:pPr>
+            <w:r>
+              <w:rPr>
+                <w:sz w:val="21"/>
+                <w:szCs w:val="21"/>
+              </w:rPr>
+              <w:t xml:space="preserve">À quoi ça sert ? Stocker des données sans schéma relationnel strict, avec une très forte scalabilité et une faible latence — typiquement pour des applications web/mobiles à fort trafic (paniers d'achat, sessions utilisateurs, catalogues produits...).</w:t>
+            </w:r>
+          </w:p>
+          <w:p>
+            <w:pPr>
+              <w:spacing w:after="60"/>
+            </w:pPr>
+            <w:r>
+              <w:rPr>
+                <w:sz w:val="21"/>
+                <w:szCs w:val="21"/>
+              </w:rPr>
+              <w:t xml:space="preserve">Comment ça marche ? On crée une table en définissant uniquement une clé primaire (pas besoin de déclarer toutes les colonnes à l'avance). DynamoDB répartit et réplique automatiquement les données sur plusieurs serveurs pour absorber la charge, sans administration de l'utilisateur.</w:t>
             </w:r>
           </w:p>
         </w:tc>
@@ -4003,7 +4390,75 @@
           <w:sz w:val="23"/>
           <w:szCs w:val="23"/>
         </w:rPr>
-        <w:t xml:space="preserve">IAM</w:t>
+        <w:t xml:space="preserve">Concepts clés</w:t>
+      </w:r>
+    </w:p>
+    <w:p>
+      <w:pPr>
+        <w:pStyle w:val="ListParagraph"/>
+        <w:numPr>
+          <w:ilvl w:val="0"/>
+          <w:numId w:val="2"/>
+        </w:numPr>
+        <w:spacing w:after="80"/>
+      </w:pPr>
+      <w:r>
+        <w:rPr>
+          <w:sz w:val="22"/>
+          <w:szCs w:val="22"/>
+        </w:rPr>
+        <w:t xml:space="preserve">Table : équivalent d'une table SQL, mais sans schéma de colonnes fixe.</w:t>
+      </w:r>
+    </w:p>
+    <w:p>
+      <w:pPr>
+        <w:pStyle w:val="ListParagraph"/>
+        <w:numPr>
+          <w:ilvl w:val="0"/>
+          <w:numId w:val="2"/>
+        </w:numPr>
+        <w:spacing w:after="80"/>
+      </w:pPr>
+      <w:r>
+        <w:rPr>
+          <w:sz w:val="22"/>
+          <w:szCs w:val="22"/>
+        </w:rPr>
+        <w:t xml:space="preserve">Clé primaire : clé de partition (partition key), éventuellement associée à une clé de tri (sort key).</w:t>
+      </w:r>
+    </w:p>
+    <w:p>
+      <w:pPr>
+        <w:pStyle w:val="ListParagraph"/>
+        <w:numPr>
+          <w:ilvl w:val="0"/>
+          <w:numId w:val="2"/>
+        </w:numPr>
+        <w:spacing w:after="80"/>
+      </w:pPr>
+      <w:r>
+        <w:rPr>
+          <w:sz w:val="22"/>
+          <w:szCs w:val="22"/>
+        </w:rPr>
+        <w:t xml:space="preserve">Capacité : mode "à la demande" (on-demand, facturé à l'usage) ou "provisionnée" (capacité réservée à l'avance).</w:t>
+      </w:r>
+    </w:p>
+    <w:p>
+      <w:pPr>
+        <w:pStyle w:val="ListParagraph"/>
+        <w:numPr>
+          <w:ilvl w:val="0"/>
+          <w:numId w:val="2"/>
+        </w:numPr>
+        <w:spacing w:after="80"/>
+      </w:pPr>
+      <w:r>
+        <w:rPr>
+          <w:sz w:val="22"/>
+          <w:szCs w:val="22"/>
+        </w:rPr>
+        <w:t xml:space="preserve">DynamoDB Streams : flux d'événements qui capture les modifications d'une table (peut déclencher une fonction Lambda).</w:t>
       </w:r>
     </w:p>
     <w:tbl>
@@ -4043,35 +4498,176 @@
                 <w:sz w:val="20"/>
                 <w:szCs w:val="20"/>
               </w:rPr>
-              <w:t xml:space="preserve">$ aws iam create-user --user-name &lt;nom&gt;</w:t>
-            </w:r>
-          </w:p>
-          <w:p>
-            <w:pPr>
-              <w:spacing w:after="40"/>
-            </w:pPr>
-            <w:r>
-              <w:rPr>
-                <w:rFonts w:ascii="Consolas" w:cs="Consolas" w:eastAsia="Consolas" w:hAnsi="Consolas"/>
-                <w:color w:val="6CE26C"/>
-                <w:sz w:val="20"/>
-                <w:szCs w:val="20"/>
-              </w:rPr>
-              <w:t xml:space="preserve">$ aws iam list-users</w:t>
-            </w:r>
-          </w:p>
-          <w:p>
-            <w:pPr>
-              <w:spacing w:after="40"/>
-            </w:pPr>
-            <w:r>
-              <w:rPr>
-                <w:rFonts w:ascii="Consolas" w:cs="Consolas" w:eastAsia="Consolas" w:hAnsi="Consolas"/>
-                <w:color w:val="6CE26C"/>
-                <w:sz w:val="20"/>
-                <w:szCs w:val="20"/>
-              </w:rPr>
-              <w:t xml:space="preserve">$ aws iam attach-group-policy --group-name &lt;groupe&gt; --policy-arn &lt;arn&gt;</w:t>
+              <w:t xml:space="preserve">$ aws dynamodb create-table --table-name Clients --attribute-definitions AttributeName=ClientId,AttributeType=S --key-schema AttributeName=ClientId,KeyType=HASH --billing-mode PAY_PER_REQUEST</w:t>
+            </w:r>
+          </w:p>
+          <w:p>
+            <w:pPr>
+              <w:spacing w:after="40"/>
+            </w:pPr>
+            <w:r>
+              <w:rPr>
+                <w:rFonts w:ascii="Consolas" w:cs="Consolas" w:eastAsia="Consolas" w:hAnsi="Consolas"/>
+                <w:color w:val="6CE26C"/>
+                <w:sz w:val="20"/>
+                <w:szCs w:val="20"/>
+              </w:rPr>
+              <w:t xml:space="preserve">$ aws dynamodb put-item --table-name Clients --item '{"ClientId": {"S": "C001"}, "Nom": {"S": "Zounon"}}'</w:t>
+            </w:r>
+          </w:p>
+          <w:p>
+            <w:pPr>
+              <w:spacing w:after="40"/>
+            </w:pPr>
+            <w:r>
+              <w:rPr>
+                <w:rFonts w:ascii="Consolas" w:cs="Consolas" w:eastAsia="Consolas" w:hAnsi="Consolas"/>
+                <w:color w:val="6CE26C"/>
+                <w:sz w:val="20"/>
+                <w:szCs w:val="20"/>
+              </w:rPr>
+              <w:t xml:space="preserve">$ aws dynamodb get-item --table-name Clients --key '{"ClientId": {"S": "C001"}}'</w:t>
+            </w:r>
+          </w:p>
+          <w:p>
+            <w:pPr>
+              <w:spacing w:after="40"/>
+            </w:pPr>
+            <w:r>
+              <w:rPr>
+                <w:rFonts w:ascii="Consolas" w:cs="Consolas" w:eastAsia="Consolas" w:hAnsi="Consolas"/>
+                <w:color w:val="6CE26C"/>
+                <w:sz w:val="20"/>
+                <w:szCs w:val="20"/>
+              </w:rPr>
+              <w:t xml:space="preserve">$ aws dynamodb scan --table-name Clients</w:t>
+            </w:r>
+          </w:p>
+          <w:p>
+            <w:pPr>
+              <w:spacing w:after="40"/>
+            </w:pPr>
+            <w:r>
+              <w:rPr>
+                <w:rFonts w:ascii="Consolas" w:cs="Consolas" w:eastAsia="Consolas" w:hAnsi="Consolas"/>
+                <w:color w:val="6CE26C"/>
+                <w:sz w:val="20"/>
+                <w:szCs w:val="20"/>
+              </w:rPr>
+              <w:t xml:space="preserve">$ aws dynamodb delete-table --table-name Clients</w:t>
+            </w:r>
+          </w:p>
+          <w:p>
+            <w:pPr>
+              <w:spacing w:before="100"/>
+            </w:pPr>
+            <w:r>
+              <w:rPr>
+                <w:rFonts w:ascii="Consolas" w:cs="Consolas" w:eastAsia="Consolas" w:hAnsi="Consolas"/>
+                <w:i/>
+                <w:iCs/>
+                <w:color w:val="CCCCCC"/>
+                <w:sz w:val="19"/>
+                <w:szCs w:val="19"/>
+              </w:rPr>
+              <w:t xml:space="preserve">→ Créer une table avec une clé de partition, y insérer un élément, le relire, parcourir toute la table, puis la supprimer.</w:t>
+            </w:r>
+          </w:p>
+        </w:tc>
+      </w:tr>
+    </w:tbl>
+    <w:p>
+      <w:pPr>
+        <w:pStyle w:val="Heading2"/>
+        <w:spacing w:after="150" w:before="300"/>
+      </w:pPr>
+      <w:r>
+        <w:rPr>
+          <w:b/>
+          <w:bCs/>
+          <w:color w:val="2E75B6"/>
+          <w:sz w:val="26"/>
+          <w:szCs w:val="26"/>
+        </w:rPr>
+        <w:t xml:space="preserve">11.3 AWS CloudFormation</w:t>
+      </w:r>
+    </w:p>
+    <w:tbl>
+      <w:tblPr>
+        <w:tblW w:type="pct" w:w="100%"/>
+        <w:tblBorders>
+          <w:top w:val="single" w:color="548235" w:sz="6"/>
+          <w:left w:val="single" w:color="548235" w:sz="6"/>
+          <w:bottom w:val="single" w:color="548235" w:sz="6"/>
+          <w:right w:val="single" w:color="548235" w:sz="6"/>
+          <w:insideH w:val="none" w:color="FFFFFF" w:sz="0"/>
+          <w:insideV w:val="none" w:color="FFFFFF" w:sz="0"/>
+        </w:tblBorders>
+      </w:tblPr>
+      <w:tblGrid>
+        <w:gridCol w:w="9350"/>
+      </w:tblGrid>
+      <w:tr>
+        <w:tc>
+          <w:tcPr>
+            <w:tcW w:type="pct" w:w="100%"/>
+            <w:shd w:fill="E2F0D9" w:val="clear"/>
+            <w:tcMar>
+              <w:top w:type="dxa" w:w="150"/>
+              <w:left w:type="dxa" w:w="200"/>
+              <w:bottom w:type="dxa" w:w="150"/>
+              <w:right w:type="dxa" w:w="200"/>
+            </w:tcMar>
+          </w:tcPr>
+          <w:p>
+            <w:pPr>
+              <w:spacing w:after="100"/>
+            </w:pPr>
+            <w:r>
+              <w:rPr>
+                <w:b/>
+                <w:bCs/>
+                <w:color w:val="548235"/>
+                <w:sz w:val="21"/>
+                <w:szCs w:val="21"/>
+              </w:rPr>
+              <w:t xml:space="preserve">🧩 SERVICE : CloudFormation</w:t>
+            </w:r>
+          </w:p>
+          <w:p>
+            <w:pPr>
+              <w:spacing w:after="60"/>
+            </w:pPr>
+            <w:r>
+              <w:rPr>
+                <w:sz w:val="21"/>
+                <w:szCs w:val="21"/>
+              </w:rPr>
+              <w:t xml:space="preserve">Qu'est-ce que c'est ? Un service d'Infrastructure as Code (IaC) : il permet de décrire toute une infrastructure AWS (EC2, S3, VPC, IAM, Lambda, DynamoDB...) dans un fichier texte appelé "template" (JSON ou YAML).</w:t>
+            </w:r>
+          </w:p>
+          <w:p>
+            <w:pPr>
+              <w:spacing w:after="60"/>
+            </w:pPr>
+            <w:r>
+              <w:rPr>
+                <w:sz w:val="21"/>
+                <w:szCs w:val="21"/>
+              </w:rPr>
+              <w:t xml:space="preserve">À quoi ça sert ? Créer, modifier ou supprimer un ensemble complet de ressources AWS de façon automatisée, reproductible et versionnable, plutôt que de tout configurer manuellement dans la console.</w:t>
+            </w:r>
+          </w:p>
+          <w:p>
+            <w:pPr>
+              <w:spacing w:after="60"/>
+            </w:pPr>
+            <w:r>
+              <w:rPr>
+                <w:sz w:val="21"/>
+                <w:szCs w:val="21"/>
+              </w:rPr>
+              <w:t xml:space="preserve">Comment ça marche ? On écrit un template YAML/JSON décrivant les ressources voulues et leurs paramètres, on le soumet à CloudFormation sous forme de "stack" (pile). Le service crée alors toutes les ressources dans le bon ordre en gérant leurs dépendances. Supprimer la stack supprime automatiquement toutes les ressources associées.</w:t>
             </w:r>
           </w:p>
         </w:tc>
@@ -4090,7 +4686,75 @@
           <w:sz w:val="23"/>
           <w:szCs w:val="23"/>
         </w:rPr>
-        <w:t xml:space="preserve">EC2</w:t>
+        <w:t xml:space="preserve">Concepts clés</w:t>
+      </w:r>
+    </w:p>
+    <w:p>
+      <w:pPr>
+        <w:pStyle w:val="ListParagraph"/>
+        <w:numPr>
+          <w:ilvl w:val="0"/>
+          <w:numId w:val="2"/>
+        </w:numPr>
+        <w:spacing w:after="80"/>
+      </w:pPr>
+      <w:r>
+        <w:rPr>
+          <w:sz w:val="22"/>
+          <w:szCs w:val="22"/>
+        </w:rPr>
+        <w:t xml:space="preserve">Template : fichier YAML/JSON décrivant les ressources, leurs propriétés et leurs dépendances.</w:t>
+      </w:r>
+    </w:p>
+    <w:p>
+      <w:pPr>
+        <w:pStyle w:val="ListParagraph"/>
+        <w:numPr>
+          <w:ilvl w:val="0"/>
+          <w:numId w:val="2"/>
+        </w:numPr>
+        <w:spacing w:after="80"/>
+      </w:pPr>
+      <w:r>
+        <w:rPr>
+          <w:sz w:val="22"/>
+          <w:szCs w:val="22"/>
+        </w:rPr>
+        <w:t xml:space="preserve">Stack (pile) : instance déployée d'un template ; regroupe toutes les ressources créées ensemble.</w:t>
+      </w:r>
+    </w:p>
+    <w:p>
+      <w:pPr>
+        <w:pStyle w:val="ListParagraph"/>
+        <w:numPr>
+          <w:ilvl w:val="0"/>
+          <w:numId w:val="2"/>
+        </w:numPr>
+        <w:spacing w:after="80"/>
+      </w:pPr>
+      <w:r>
+        <w:rPr>
+          <w:sz w:val="22"/>
+          <w:szCs w:val="22"/>
+        </w:rPr>
+        <w:t xml:space="preserve">Paramètres et Outputs : valeurs injectables au déploiement, et valeurs renvoyées après création (ex. l'URL d'une API).</w:t>
+      </w:r>
+    </w:p>
+    <w:p>
+      <w:pPr>
+        <w:pStyle w:val="ListParagraph"/>
+        <w:numPr>
+          <w:ilvl w:val="0"/>
+          <w:numId w:val="2"/>
+        </w:numPr>
+        <w:spacing w:after="80"/>
+      </w:pPr>
+      <w:r>
+        <w:rPr>
+          <w:sz w:val="22"/>
+          <w:szCs w:val="22"/>
+        </w:rPr>
+        <w:t xml:space="preserve">Rollback automatique : en cas d'échec de création, CloudFormation annule et supprime ce qui a déjà été créé.</w:t>
       </w:r>
     </w:p>
     <w:tbl>
@@ -4130,54 +4794,151 @@
                 <w:sz w:val="20"/>
                 <w:szCs w:val="20"/>
               </w:rPr>
-              <w:t xml:space="preserve">$ aws ec2 run-instances --image-id &lt;ami&gt; --instance-type t2.micro --key-name &lt;cle&gt;</w:t>
-            </w:r>
-          </w:p>
-          <w:p>
-            <w:pPr>
-              <w:spacing w:after="40"/>
-            </w:pPr>
-            <w:r>
-              <w:rPr>
-                <w:rFonts w:ascii="Consolas" w:cs="Consolas" w:eastAsia="Consolas" w:hAnsi="Consolas"/>
-                <w:color w:val="6CE26C"/>
-                <w:sz w:val="20"/>
-                <w:szCs w:val="20"/>
-              </w:rPr>
-              <w:t xml:space="preserve">$ aws ec2 describe-instances</w:t>
-            </w:r>
-          </w:p>
-          <w:p>
-            <w:pPr>
-              <w:spacing w:after="40"/>
-            </w:pPr>
-            <w:r>
-              <w:rPr>
-                <w:rFonts w:ascii="Consolas" w:cs="Consolas" w:eastAsia="Consolas" w:hAnsi="Consolas"/>
-                <w:color w:val="6CE26C"/>
-                <w:sz w:val="20"/>
-                <w:szCs w:val="20"/>
-              </w:rPr>
-              <w:t xml:space="preserve">$ aws ec2 stop-instances --instance-ids &lt;id&gt;</w:t>
-            </w:r>
-          </w:p>
-          <w:p>
-            <w:pPr>
-              <w:spacing w:after="40"/>
-            </w:pPr>
-            <w:r>
-              <w:rPr>
-                <w:rFonts w:ascii="Consolas" w:cs="Consolas" w:eastAsia="Consolas" w:hAnsi="Consolas"/>
-                <w:color w:val="6CE26C"/>
-                <w:sz w:val="20"/>
-                <w:szCs w:val="20"/>
-              </w:rPr>
-              <w:t xml:space="preserve">$ aws ec2 terminate-instances --instance-ids &lt;id&gt;</w:t>
+              <w:t xml:space="preserve">$ aws cloudformation create-stack --stack-name maStack --template-body file://template.yaml</w:t>
+            </w:r>
+          </w:p>
+          <w:p>
+            <w:pPr>
+              <w:spacing w:after="40"/>
+            </w:pPr>
+            <w:r>
+              <w:rPr>
+                <w:rFonts w:ascii="Consolas" w:cs="Consolas" w:eastAsia="Consolas" w:hAnsi="Consolas"/>
+                <w:color w:val="6CE26C"/>
+                <w:sz w:val="20"/>
+                <w:szCs w:val="20"/>
+              </w:rPr>
+              <w:t xml:space="preserve">$ aws cloudformation describe-stacks --stack-name maStack</w:t>
+            </w:r>
+          </w:p>
+          <w:p>
+            <w:pPr>
+              <w:spacing w:after="40"/>
+            </w:pPr>
+            <w:r>
+              <w:rPr>
+                <w:rFonts w:ascii="Consolas" w:cs="Consolas" w:eastAsia="Consolas" w:hAnsi="Consolas"/>
+                <w:color w:val="6CE26C"/>
+                <w:sz w:val="20"/>
+                <w:szCs w:val="20"/>
+              </w:rPr>
+              <w:t xml:space="preserve">$ aws cloudformation update-stack --stack-name maStack --template-body file://template.yaml</w:t>
+            </w:r>
+          </w:p>
+          <w:p>
+            <w:pPr>
+              <w:spacing w:after="40"/>
+            </w:pPr>
+            <w:r>
+              <w:rPr>
+                <w:rFonts w:ascii="Consolas" w:cs="Consolas" w:eastAsia="Consolas" w:hAnsi="Consolas"/>
+                <w:color w:val="6CE26C"/>
+                <w:sz w:val="20"/>
+                <w:szCs w:val="20"/>
+              </w:rPr>
+              <w:t xml:space="preserve">$ aws cloudformation delete-stack --stack-name maStack</w:t>
+            </w:r>
+          </w:p>
+          <w:p>
+            <w:pPr>
+              <w:spacing w:before="100"/>
+            </w:pPr>
+            <w:r>
+              <w:rPr>
+                <w:rFonts w:ascii="Consolas" w:cs="Consolas" w:eastAsia="Consolas" w:hAnsi="Consolas"/>
+                <w:i/>
+                <w:iCs/>
+                <w:color w:val="CCCCCC"/>
+                <w:sz w:val="19"/>
+                <w:szCs w:val="19"/>
+              </w:rPr>
+              <w:t xml:space="preserve">→ Créer une stack à partir d'un template local, consulter son état, la mettre à jour, puis la supprimer (ce qui supprime toutes les ressources qu'elle contient).</w:t>
             </w:r>
           </w:p>
         </w:tc>
       </w:tr>
     </w:tbl>
+    <w:tbl>
+      <w:tblPr>
+        <w:tblW w:type="pct" w:w="100%"/>
+        <w:tblBorders>
+          <w:top w:val="single" w:color="BF8F00" w:sz="6"/>
+          <w:left w:val="single" w:color="BF8F00" w:sz="6"/>
+          <w:bottom w:val="single" w:color="BF8F00" w:sz="6"/>
+          <w:right w:val="single" w:color="BF8F00" w:sz="6"/>
+          <w:insideH w:val="none" w:color="FFFFFF" w:sz="0"/>
+          <w:insideV w:val="none" w:color="FFFFFF" w:sz="0"/>
+        </w:tblBorders>
+      </w:tblPr>
+      <w:tblGrid>
+        <w:gridCol w:w="9350"/>
+      </w:tblGrid>
+      <w:tr>
+        <w:tc>
+          <w:tcPr>
+            <w:tcW w:type="pct" w:w="100%"/>
+            <w:shd w:fill="FFF2CC" w:val="clear"/>
+            <w:tcMar>
+              <w:top w:type="dxa" w:w="150"/>
+              <w:left w:type="dxa" w:w="200"/>
+              <w:bottom w:type="dxa" w:w="150"/>
+              <w:right w:type="dxa" w:w="200"/>
+            </w:tcMar>
+          </w:tcPr>
+          <w:p>
+            <w:pPr>
+              <w:spacing w:after="100"/>
+            </w:pPr>
+            <w:r>
+              <w:rPr>
+                <w:b/>
+                <w:bCs/>
+                <w:color w:val="BF8F00"/>
+                <w:sz w:val="21"/>
+                <w:szCs w:val="21"/>
+              </w:rPr>
+              <w:t xml:space="preserve">💡 À retenir</w:t>
+            </w:r>
+          </w:p>
+          <w:p>
+            <w:pPr>
+              <w:spacing w:after="60"/>
+            </w:pPr>
+            <w:r>
+              <w:rPr>
+                <w:sz w:val="21"/>
+                <w:szCs w:val="21"/>
+              </w:rPr>
+              <w:t xml:space="preserve">CloudFormation est l'équivalent AWS natif d'outils comme Terraform : l'idée commune est de décrire l'infrastructure comme du code, versionnable dans Git, plutôt que de la construire à la main dans la console.</w:t>
+            </w:r>
+          </w:p>
+        </w:tc>
+      </w:tr>
+    </w:tbl>
+    <w:p>
+      <w:r>
+        <w:br w:type="page"/>
+      </w:r>
+    </w:p>
+    <w:p>
+      <w:pPr>
+        <w:pStyle w:val="Heading1"/>
+        <w:pBdr>
+          <w:bottom w:val="single" w:color="1F4E79" w:sz="6" w:space="4"/>
+        </w:pBdr>
+        <w:spacing w:after="200" w:before="400"/>
+      </w:pPr>
+      <w:r>
+        <w:rPr>
+          <w:b/>
+          <w:bCs/>
+          <w:color w:val="1F4E79"/>
+          <w:sz w:val="32"/>
+          <w:szCs w:val="32"/>
+        </w:rPr>
+        <w:t xml:space="preserve">12. Récapitulatif des commandes essentielles</w:t>
+      </w:r>
+    </w:p>
     <w:p>
       <w:pPr>
         <w:pStyle w:val="Heading3"/>
@@ -4191,7 +4952,7 @@
           <w:sz w:val="23"/>
           <w:szCs w:val="23"/>
         </w:rPr>
-        <w:t xml:space="preserve">S3</w:t>
+        <w:t xml:space="preserve">Configuration générale</w:t>
       </w:r>
     </w:p>
     <w:tbl>
@@ -4231,49 +4992,35 @@
                 <w:sz w:val="20"/>
                 <w:szCs w:val="20"/>
               </w:rPr>
-              <w:t xml:space="preserve">$ aws s3 mb s3://&lt;nom-bucket&gt;</w:t>
-            </w:r>
-          </w:p>
-          <w:p>
-            <w:pPr>
-              <w:spacing w:after="40"/>
-            </w:pPr>
-            <w:r>
-              <w:rPr>
-                <w:rFonts w:ascii="Consolas" w:cs="Consolas" w:eastAsia="Consolas" w:hAnsi="Consolas"/>
-                <w:color w:val="6CE26C"/>
-                <w:sz w:val="20"/>
-                <w:szCs w:val="20"/>
-              </w:rPr>
-              <w:t xml:space="preserve">$ aws s3 cp &lt;fichier&gt; s3://&lt;nom-bucket&gt;/</w:t>
-            </w:r>
-          </w:p>
-          <w:p>
-            <w:pPr>
-              <w:spacing w:after="40"/>
-            </w:pPr>
-            <w:r>
-              <w:rPr>
-                <w:rFonts w:ascii="Consolas" w:cs="Consolas" w:eastAsia="Consolas" w:hAnsi="Consolas"/>
-                <w:color w:val="6CE26C"/>
-                <w:sz w:val="20"/>
-                <w:szCs w:val="20"/>
-              </w:rPr>
-              <w:t xml:space="preserve">$ aws s3 ls s3://&lt;nom-bucket&gt;</w:t>
-            </w:r>
-          </w:p>
-          <w:p>
-            <w:pPr>
-              <w:spacing w:after="40"/>
-            </w:pPr>
-            <w:r>
-              <w:rPr>
-                <w:rFonts w:ascii="Consolas" w:cs="Consolas" w:eastAsia="Consolas" w:hAnsi="Consolas"/>
-                <w:color w:val="6CE26C"/>
-                <w:sz w:val="20"/>
-                <w:szCs w:val="20"/>
-              </w:rPr>
-              <w:t xml:space="preserve">$ aws s3 sync &lt;dossier-local&gt; s3://&lt;nom-bucket&gt;/</w:t>
+              <w:t xml:space="preserve">$ aws configure</w:t>
+            </w:r>
+          </w:p>
+          <w:p>
+            <w:pPr>
+              <w:spacing w:after="40"/>
+            </w:pPr>
+            <w:r>
+              <w:rPr>
+                <w:rFonts w:ascii="Consolas" w:cs="Consolas" w:eastAsia="Consolas" w:hAnsi="Consolas"/>
+                <w:color w:val="6CE26C"/>
+                <w:sz w:val="20"/>
+                <w:szCs w:val="20"/>
+              </w:rPr>
+              <w:t xml:space="preserve">$ aws --version</w:t>
+            </w:r>
+          </w:p>
+          <w:p>
+            <w:pPr>
+              <w:spacing w:after="40"/>
+            </w:pPr>
+            <w:r>
+              <w:rPr>
+                <w:rFonts w:ascii="Consolas" w:cs="Consolas" w:eastAsia="Consolas" w:hAnsi="Consolas"/>
+                <w:color w:val="6CE26C"/>
+                <w:sz w:val="20"/>
+                <w:szCs w:val="20"/>
+              </w:rPr>
+              <w:t xml:space="preserve">$ aws sts get-caller-identity</w:t>
             </w:r>
           </w:p>
         </w:tc>
@@ -4292,7 +5039,7 @@
           <w:sz w:val="23"/>
           <w:szCs w:val="23"/>
         </w:rPr>
-        <w:t xml:space="preserve">VPC / RDS / CloudWatch</w:t>
+        <w:t xml:space="preserve">IAM</w:t>
       </w:r>
     </w:p>
     <w:tbl>
@@ -4332,6 +5079,295 @@
                 <w:sz w:val="20"/>
                 <w:szCs w:val="20"/>
               </w:rPr>
+              <w:t xml:space="preserve">$ aws iam create-user --user-name &lt;nom&gt;</w:t>
+            </w:r>
+          </w:p>
+          <w:p>
+            <w:pPr>
+              <w:spacing w:after="40"/>
+            </w:pPr>
+            <w:r>
+              <w:rPr>
+                <w:rFonts w:ascii="Consolas" w:cs="Consolas" w:eastAsia="Consolas" w:hAnsi="Consolas"/>
+                <w:color w:val="6CE26C"/>
+                <w:sz w:val="20"/>
+                <w:szCs w:val="20"/>
+              </w:rPr>
+              <w:t xml:space="preserve">$ aws iam list-users</w:t>
+            </w:r>
+          </w:p>
+          <w:p>
+            <w:pPr>
+              <w:spacing w:after="40"/>
+            </w:pPr>
+            <w:r>
+              <w:rPr>
+                <w:rFonts w:ascii="Consolas" w:cs="Consolas" w:eastAsia="Consolas" w:hAnsi="Consolas"/>
+                <w:color w:val="6CE26C"/>
+                <w:sz w:val="20"/>
+                <w:szCs w:val="20"/>
+              </w:rPr>
+              <w:t xml:space="preserve">$ aws iam attach-group-policy --group-name &lt;groupe&gt; --policy-arn &lt;arn&gt;</w:t>
+            </w:r>
+          </w:p>
+        </w:tc>
+      </w:tr>
+    </w:tbl>
+    <w:p>
+      <w:pPr>
+        <w:pStyle w:val="Heading3"/>
+        <w:spacing w:after="100" w:before="200"/>
+      </w:pPr>
+      <w:r>
+        <w:rPr>
+          <w:b/>
+          <w:bCs/>
+          <w:color w:val="404040"/>
+          <w:sz w:val="23"/>
+          <w:szCs w:val="23"/>
+        </w:rPr>
+        <w:t xml:space="preserve">EC2</w:t>
+      </w:r>
+    </w:p>
+    <w:tbl>
+      <w:tblPr>
+        <w:tblW w:type="pct" w:w="100%"/>
+        <w:tblBorders>
+          <w:top w:val="single" w:color="000000" w:sz="4"/>
+          <w:left w:val="single" w:color="000000" w:sz="4"/>
+          <w:bottom w:val="single" w:color="000000" w:sz="4"/>
+          <w:right w:val="single" w:color="000000" w:sz="4"/>
+          <w:insideH w:val="none" w:color="FFFFFF" w:sz="0"/>
+          <w:insideV w:val="none" w:color="FFFFFF" w:sz="0"/>
+        </w:tblBorders>
+      </w:tblPr>
+      <w:tblGrid>
+        <w:gridCol w:w="9350"/>
+      </w:tblGrid>
+      <w:tr>
+        <w:tc>
+          <w:tcPr>
+            <w:shd w:fill="1E1E1E" w:val="clear"/>
+            <w:tcMar>
+              <w:top w:type="dxa" w:w="150"/>
+              <w:left w:type="dxa" w:w="200"/>
+              <w:bottom w:type="dxa" w:w="150"/>
+              <w:right w:type="dxa" w:w="200"/>
+            </w:tcMar>
+          </w:tcPr>
+          <w:p>
+            <w:pPr>
+              <w:spacing w:after="40"/>
+            </w:pPr>
+            <w:r>
+              <w:rPr>
+                <w:rFonts w:ascii="Consolas" w:cs="Consolas" w:eastAsia="Consolas" w:hAnsi="Consolas"/>
+                <w:color w:val="6CE26C"/>
+                <w:sz w:val="20"/>
+                <w:szCs w:val="20"/>
+              </w:rPr>
+              <w:t xml:space="preserve">$ aws ec2 run-instances --image-id &lt;ami&gt; --instance-type t2.micro --key-name &lt;cle&gt;</w:t>
+            </w:r>
+          </w:p>
+          <w:p>
+            <w:pPr>
+              <w:spacing w:after="40"/>
+            </w:pPr>
+            <w:r>
+              <w:rPr>
+                <w:rFonts w:ascii="Consolas" w:cs="Consolas" w:eastAsia="Consolas" w:hAnsi="Consolas"/>
+                <w:color w:val="6CE26C"/>
+                <w:sz w:val="20"/>
+                <w:szCs w:val="20"/>
+              </w:rPr>
+              <w:t xml:space="preserve">$ aws ec2 describe-instances</w:t>
+            </w:r>
+          </w:p>
+          <w:p>
+            <w:pPr>
+              <w:spacing w:after="40"/>
+            </w:pPr>
+            <w:r>
+              <w:rPr>
+                <w:rFonts w:ascii="Consolas" w:cs="Consolas" w:eastAsia="Consolas" w:hAnsi="Consolas"/>
+                <w:color w:val="6CE26C"/>
+                <w:sz w:val="20"/>
+                <w:szCs w:val="20"/>
+              </w:rPr>
+              <w:t xml:space="preserve">$ aws ec2 stop-instances --instance-ids &lt;id&gt;</w:t>
+            </w:r>
+          </w:p>
+          <w:p>
+            <w:pPr>
+              <w:spacing w:after="40"/>
+            </w:pPr>
+            <w:r>
+              <w:rPr>
+                <w:rFonts w:ascii="Consolas" w:cs="Consolas" w:eastAsia="Consolas" w:hAnsi="Consolas"/>
+                <w:color w:val="6CE26C"/>
+                <w:sz w:val="20"/>
+                <w:szCs w:val="20"/>
+              </w:rPr>
+              <w:t xml:space="preserve">$ aws ec2 terminate-instances --instance-ids &lt;id&gt;</w:t>
+            </w:r>
+          </w:p>
+        </w:tc>
+      </w:tr>
+    </w:tbl>
+    <w:p>
+      <w:pPr>
+        <w:pStyle w:val="Heading3"/>
+        <w:spacing w:after="100" w:before="200"/>
+      </w:pPr>
+      <w:r>
+        <w:rPr>
+          <w:b/>
+          <w:bCs/>
+          <w:color w:val="404040"/>
+          <w:sz w:val="23"/>
+          <w:szCs w:val="23"/>
+        </w:rPr>
+        <w:t xml:space="preserve">S3</w:t>
+      </w:r>
+    </w:p>
+    <w:tbl>
+      <w:tblPr>
+        <w:tblW w:type="pct" w:w="100%"/>
+        <w:tblBorders>
+          <w:top w:val="single" w:color="000000" w:sz="4"/>
+          <w:left w:val="single" w:color="000000" w:sz="4"/>
+          <w:bottom w:val="single" w:color="000000" w:sz="4"/>
+          <w:right w:val="single" w:color="000000" w:sz="4"/>
+          <w:insideH w:val="none" w:color="FFFFFF" w:sz="0"/>
+          <w:insideV w:val="none" w:color="FFFFFF" w:sz="0"/>
+        </w:tblBorders>
+      </w:tblPr>
+      <w:tblGrid>
+        <w:gridCol w:w="9350"/>
+      </w:tblGrid>
+      <w:tr>
+        <w:tc>
+          <w:tcPr>
+            <w:shd w:fill="1E1E1E" w:val="clear"/>
+            <w:tcMar>
+              <w:top w:type="dxa" w:w="150"/>
+              <w:left w:type="dxa" w:w="200"/>
+              <w:bottom w:type="dxa" w:w="150"/>
+              <w:right w:type="dxa" w:w="200"/>
+            </w:tcMar>
+          </w:tcPr>
+          <w:p>
+            <w:pPr>
+              <w:spacing w:after="40"/>
+            </w:pPr>
+            <w:r>
+              <w:rPr>
+                <w:rFonts w:ascii="Consolas" w:cs="Consolas" w:eastAsia="Consolas" w:hAnsi="Consolas"/>
+                <w:color w:val="6CE26C"/>
+                <w:sz w:val="20"/>
+                <w:szCs w:val="20"/>
+              </w:rPr>
+              <w:t xml:space="preserve">$ aws s3 mb s3://&lt;nom-bucket&gt;</w:t>
+            </w:r>
+          </w:p>
+          <w:p>
+            <w:pPr>
+              <w:spacing w:after="40"/>
+            </w:pPr>
+            <w:r>
+              <w:rPr>
+                <w:rFonts w:ascii="Consolas" w:cs="Consolas" w:eastAsia="Consolas" w:hAnsi="Consolas"/>
+                <w:color w:val="6CE26C"/>
+                <w:sz w:val="20"/>
+                <w:szCs w:val="20"/>
+              </w:rPr>
+              <w:t xml:space="preserve">$ aws s3 cp &lt;fichier&gt; s3://&lt;nom-bucket&gt;/</w:t>
+            </w:r>
+          </w:p>
+          <w:p>
+            <w:pPr>
+              <w:spacing w:after="40"/>
+            </w:pPr>
+            <w:r>
+              <w:rPr>
+                <w:rFonts w:ascii="Consolas" w:cs="Consolas" w:eastAsia="Consolas" w:hAnsi="Consolas"/>
+                <w:color w:val="6CE26C"/>
+                <w:sz w:val="20"/>
+                <w:szCs w:val="20"/>
+              </w:rPr>
+              <w:t xml:space="preserve">$ aws s3 ls s3://&lt;nom-bucket&gt;</w:t>
+            </w:r>
+          </w:p>
+          <w:p>
+            <w:pPr>
+              <w:spacing w:after="40"/>
+            </w:pPr>
+            <w:r>
+              <w:rPr>
+                <w:rFonts w:ascii="Consolas" w:cs="Consolas" w:eastAsia="Consolas" w:hAnsi="Consolas"/>
+                <w:color w:val="6CE26C"/>
+                <w:sz w:val="20"/>
+                <w:szCs w:val="20"/>
+              </w:rPr>
+              <w:t xml:space="preserve">$ aws s3 sync &lt;dossier-local&gt; s3://&lt;nom-bucket&gt;/</w:t>
+            </w:r>
+          </w:p>
+        </w:tc>
+      </w:tr>
+    </w:tbl>
+    <w:p>
+      <w:pPr>
+        <w:pStyle w:val="Heading3"/>
+        <w:spacing w:after="100" w:before="200"/>
+      </w:pPr>
+      <w:r>
+        <w:rPr>
+          <w:b/>
+          <w:bCs/>
+          <w:color w:val="404040"/>
+          <w:sz w:val="23"/>
+          <w:szCs w:val="23"/>
+        </w:rPr>
+        <w:t xml:space="preserve">VPC / RDS / CloudWatch</w:t>
+      </w:r>
+    </w:p>
+    <w:tbl>
+      <w:tblPr>
+        <w:tblW w:type="pct" w:w="100%"/>
+        <w:tblBorders>
+          <w:top w:val="single" w:color="000000" w:sz="4"/>
+          <w:left w:val="single" w:color="000000" w:sz="4"/>
+          <w:bottom w:val="single" w:color="000000" w:sz="4"/>
+          <w:right w:val="single" w:color="000000" w:sz="4"/>
+          <w:insideH w:val="none" w:color="FFFFFF" w:sz="0"/>
+          <w:insideV w:val="none" w:color="FFFFFF" w:sz="0"/>
+        </w:tblBorders>
+      </w:tblPr>
+      <w:tblGrid>
+        <w:gridCol w:w="9350"/>
+      </w:tblGrid>
+      <w:tr>
+        <w:tc>
+          <w:tcPr>
+            <w:shd w:fill="1E1E1E" w:val="clear"/>
+            <w:tcMar>
+              <w:top w:type="dxa" w:w="150"/>
+              <w:left w:type="dxa" w:w="200"/>
+              <w:bottom w:type="dxa" w:w="150"/>
+              <w:right w:type="dxa" w:w="200"/>
+            </w:tcMar>
+          </w:tcPr>
+          <w:p>
+            <w:pPr>
+              <w:spacing w:after="40"/>
+            </w:pPr>
+            <w:r>
+              <w:rPr>
+                <w:rFonts w:ascii="Consolas" w:cs="Consolas" w:eastAsia="Consolas" w:hAnsi="Consolas"/>
+                <w:color w:val="6CE26C"/>
+                <w:sz w:val="20"/>
+                <w:szCs w:val="20"/>
+              </w:rPr>
               <w:t xml:space="preserve">$ aws ec2 create-vpc --cidr-block 10.0.0.0/16</w:t>
             </w:r>
           </w:p>
@@ -4361,6 +5397,135 @@
                 <w:szCs w:val="20"/>
               </w:rPr>
               <w:t xml:space="preserve">$ aws cloudwatch put-metric-alarm --alarm-name &lt;nom&gt; --metric-name CPUUtilization ...</w:t>
+            </w:r>
+          </w:p>
+        </w:tc>
+      </w:tr>
+    </w:tbl>
+    <w:p>
+      <w:pPr>
+        <w:pStyle w:val="Heading3"/>
+        <w:spacing w:after="100" w:before="200"/>
+      </w:pPr>
+      <w:r>
+        <w:rPr>
+          <w:b/>
+          <w:bCs/>
+          <w:color w:val="404040"/>
+          <w:sz w:val="23"/>
+          <w:szCs w:val="23"/>
+        </w:rPr>
+        <w:t xml:space="preserve">Lambda / DynamoDB / CloudFormation</w:t>
+      </w:r>
+    </w:p>
+    <w:tbl>
+      <w:tblPr>
+        <w:tblW w:type="pct" w:w="100%"/>
+        <w:tblBorders>
+          <w:top w:val="single" w:color="000000" w:sz="4"/>
+          <w:left w:val="single" w:color="000000" w:sz="4"/>
+          <w:bottom w:val="single" w:color="000000" w:sz="4"/>
+          <w:right w:val="single" w:color="000000" w:sz="4"/>
+          <w:insideH w:val="none" w:color="FFFFFF" w:sz="0"/>
+          <w:insideV w:val="none" w:color="FFFFFF" w:sz="0"/>
+        </w:tblBorders>
+      </w:tblPr>
+      <w:tblGrid>
+        <w:gridCol w:w="9350"/>
+      </w:tblGrid>
+      <w:tr>
+        <w:tc>
+          <w:tcPr>
+            <w:shd w:fill="1E1E1E" w:val="clear"/>
+            <w:tcMar>
+              <w:top w:type="dxa" w:w="150"/>
+              <w:left w:type="dxa" w:w="200"/>
+              <w:bottom w:type="dxa" w:w="150"/>
+              <w:right w:type="dxa" w:w="200"/>
+            </w:tcMar>
+          </w:tcPr>
+          <w:p>
+            <w:pPr>
+              <w:spacing w:after="40"/>
+            </w:pPr>
+            <w:r>
+              <w:rPr>
+                <w:rFonts w:ascii="Consolas" w:cs="Consolas" w:eastAsia="Consolas" w:hAnsi="Consolas"/>
+                <w:color w:val="6CE26C"/>
+                <w:sz w:val="20"/>
+                <w:szCs w:val="20"/>
+              </w:rPr>
+              <w:t xml:space="preserve">$ aws lambda create-function --function-name &lt;nom&gt; --runtime python3.12 --handler app.handler --zip-file fileb://fonction.zip</w:t>
+            </w:r>
+          </w:p>
+          <w:p>
+            <w:pPr>
+              <w:spacing w:after="40"/>
+            </w:pPr>
+            <w:r>
+              <w:rPr>
+                <w:rFonts w:ascii="Consolas" w:cs="Consolas" w:eastAsia="Consolas" w:hAnsi="Consolas"/>
+                <w:color w:val="6CE26C"/>
+                <w:sz w:val="20"/>
+                <w:szCs w:val="20"/>
+              </w:rPr>
+              <w:t xml:space="preserve">$ aws lambda invoke --function-name &lt;nom&gt; resultat.json</w:t>
+            </w:r>
+          </w:p>
+          <w:p>
+            <w:pPr>
+              <w:spacing w:after="40"/>
+            </w:pPr>
+            <w:r>
+              <w:rPr>
+                <w:rFonts w:ascii="Consolas" w:cs="Consolas" w:eastAsia="Consolas" w:hAnsi="Consolas"/>
+                <w:color w:val="6CE26C"/>
+                <w:sz w:val="20"/>
+                <w:szCs w:val="20"/>
+              </w:rPr>
+              <w:t xml:space="preserve">$ aws dynamodb create-table --table-name &lt;table&gt; --attribute-definitions ... --key-schema ... --billing-mode PAY_PER_REQUEST</w:t>
+            </w:r>
+          </w:p>
+          <w:p>
+            <w:pPr>
+              <w:spacing w:after="40"/>
+            </w:pPr>
+            <w:r>
+              <w:rPr>
+                <w:rFonts w:ascii="Consolas" w:cs="Consolas" w:eastAsia="Consolas" w:hAnsi="Consolas"/>
+                <w:color w:val="6CE26C"/>
+                <w:sz w:val="20"/>
+                <w:szCs w:val="20"/>
+              </w:rPr>
+              <w:t xml:space="preserve">$ aws dynamodb scan --table-name &lt;table&gt;</w:t>
+            </w:r>
+          </w:p>
+          <w:p>
+            <w:pPr>
+              <w:spacing w:after="40"/>
+            </w:pPr>
+            <w:r>
+              <w:rPr>
+                <w:rFonts w:ascii="Consolas" w:cs="Consolas" w:eastAsia="Consolas" w:hAnsi="Consolas"/>
+                <w:color w:val="6CE26C"/>
+                <w:sz w:val="20"/>
+                <w:szCs w:val="20"/>
+              </w:rPr>
+              <w:t xml:space="preserve">$ aws cloudformation create-stack --stack-name &lt;nom&gt; --template-body file://template.yaml</w:t>
+            </w:r>
+          </w:p>
+          <w:p>
+            <w:pPr>
+              <w:spacing w:after="40"/>
+            </w:pPr>
+            <w:r>
+              <w:rPr>
+                <w:rFonts w:ascii="Consolas" w:cs="Consolas" w:eastAsia="Consolas" w:hAnsi="Consolas"/>
+                <w:color w:val="6CE26C"/>
+                <w:sz w:val="20"/>
+                <w:szCs w:val="20"/>
+              </w:rPr>
+              <w:t xml:space="preserve">$ aws cloudformation delete-stack --stack-name &lt;nom&gt;</w:t>
             </w:r>
           </w:p>
         </w:tc>
@@ -4387,7 +5552,7 @@
           <w:sz w:val="32"/>
           <w:szCs w:val="32"/>
         </w:rPr>
-        <w:t xml:space="preserve">12. Ressources et sources</w:t>
+        <w:t xml:space="preserve">13. Ressources et sources</w:t>
       </w:r>
     </w:p>
     <w:p>
@@ -4519,6 +5684,57 @@
           <w:szCs w:val="22"/>
         </w:rPr>
         <w:t xml:space="preserve">AWS S3 - Guide utilisateur : https://docs.aws.amazon.com/s3</w:t>
+      </w:r>
+    </w:p>
+    <w:p>
+      <w:pPr>
+        <w:pStyle w:val="ListParagraph"/>
+        <w:numPr>
+          <w:ilvl w:val="0"/>
+          <w:numId w:val="2"/>
+        </w:numPr>
+        <w:spacing w:after="80"/>
+      </w:pPr>
+      <w:r>
+        <w:rPr>
+          <w:sz w:val="22"/>
+          <w:szCs w:val="22"/>
+        </w:rPr>
+        <w:t xml:space="preserve">AWS Lambda - Guide utilisateur : https://docs.aws.amazon.com/lambda</w:t>
+      </w:r>
+    </w:p>
+    <w:p>
+      <w:pPr>
+        <w:pStyle w:val="ListParagraph"/>
+        <w:numPr>
+          <w:ilvl w:val="0"/>
+          <w:numId w:val="2"/>
+        </w:numPr>
+        <w:spacing w:after="80"/>
+      </w:pPr>
+      <w:r>
+        <w:rPr>
+          <w:sz w:val="22"/>
+          <w:szCs w:val="22"/>
+        </w:rPr>
+        <w:t xml:space="preserve">Amazon DynamoDB - Guide utilisateur : https://docs.aws.amazon.com/dynamodb</w:t>
+      </w:r>
+    </w:p>
+    <w:p>
+      <w:pPr>
+        <w:pStyle w:val="ListParagraph"/>
+        <w:numPr>
+          <w:ilvl w:val="0"/>
+          <w:numId w:val="2"/>
+        </w:numPr>
+        <w:spacing w:after="80"/>
+      </w:pPr>
+      <w:r>
+        <w:rPr>
+          <w:sz w:val="22"/>
+          <w:szCs w:val="22"/>
+        </w:rPr>
+        <w:t xml:space="preserve">AWS CloudFormation - Guide utilisateur : https://docs.aws.amazon.com/cloudformation</w:t>
       </w:r>
     </w:p>
     <w:p>

</xml_diff>